<commit_message>
Add 30-day productivity variant to Installation Planner; update related calculations and UI behavior in Doc
</commit_message>
<xml_diff>
--- a/Ramp_Up_Logic_Explained.docx
+++ b/Ramp_Up_Logic_Explained.docx
@@ -447,6 +447,293 @@
       </w:pPr>
       <w:r>
         <w:t>Force the curve to be non-decreasing day-over-day (productivity should never appear to drop as a machine ramps up).</w:t>
+      </w:r>
+    </w:p>
+    <w:p>
+      <w:pPr>
+        <w:pStyle w:val="Heading2"/>
+      </w:pPr>
+      <w:r>
+        <w:t>2.3 The 30-day variant — same formula, wider window</w:t>
+      </w:r>
+    </w:p>
+    <w:p>
+      <w:r>
+        <w:t>The Installation Planner's Productivity field can be switched between a “Last 7 days” and a “Last 30 days” basis (a small toggle above the Productivity input). Both the displayed Productivity number AND the Ramp-up curve switch together, so the curve shown is always derived from the same time basis as the productivity figure next to it — never a 7-day curve paired with a 30-day number, or vice versa.</w:t>
+      </w:r>
+    </w:p>
+    <w:p>
+      <w:r>
+        <w:t>File: js/data.js — deriveAdaptiveRamp(windowDays, mp, pr, edgeSample) now takes a 4th, optional parameter.</w:t>
+      </w:r>
+    </w:p>
+    <w:p>
+      <w:r>
+        <w:t>What changed:</w:t>
+      </w:r>
+    </w:p>
+    <w:p>
+      <w:pPr>
+        <w:pStyle w:val="ListBullet"/>
+      </w:pPr>
+      <w:r>
+        <w:t>windowDays: for the 30-day variant this is a 30-day array (anchor date and the 29 prior days) instead of the original 7-day array. Every daily productivity point (piles ÷ machine-hours for that day) is computed exactly the same way as before — the function itself is unchanged in this respect.</w:t>
+      </w:r>
+    </w:p>
+    <w:p>
+      <w:pPr>
+        <w:pStyle w:val="ListBullet"/>
+      </w:pPr>
+      <w:r>
+        <w:t>edgeSample (new parameter): how many days at each end of the window are averaged for the first-vs-last trend check. The 7-day call keeps the original value of 3 (avgFirst3 / avgLast3, unchanged behavior). The 30-day call uses edgeSample = 7, i.e. avgFirst7 / avgLast7.</w:t>
+      </w:r>
+    </w:p>
+    <w:p>
+      <w:pPr>
+        <w:pStyle w:val="ListBullet"/>
+      </w:pPr>
+      <w:r>
+        <w:t>Why 7, not 3, for the 30-day window: comparing only 3 days out of a 30-day span is a very thin, noisy slice — 3 days is a meaningful fraction of a 7-day window (about 43%) but a negligible fraction of 30 days (10%). Using 7 days at each end keeps roughly the same proportion of “edge” data being compared, so the trend detection remains statistically meaningful at the longer scale.</w:t>
+      </w:r>
+    </w:p>
+    <w:p>
+      <w:r>
+        <w:t>Every other formula — median, target, initialFactor, hasClearRamp, rampDays, and the linear interpolation that builds the profile — is identical to the 7-day logic in section 2.2. The 30-day variant is the same algorithm run against a longer daily series with a proportionally wider edge sample; it is not a different model.</w:t>
+      </w:r>
+    </w:p>
+    <w:p>
+      <w:r>
+        <w:t>Result fields (js/data.js, computeDefaults return value):</w:t>
+      </w:r>
+    </w:p>
+    <w:tbl>
+      <w:tblPr>
+        <w:tblStyle w:val="LightGrid-Accent1"/>
+        <w:tblW w:type="auto" w:w="0"/>
+        <w:jc w:val="center"/>
+        <w:tblLook w:firstColumn="1" w:firstRow="1" w:lastColumn="0" w:lastRow="0" w:noHBand="0" w:noVBand="1" w:val="04A0"/>
+      </w:tblPr>
+      <w:tblGrid>
+        <w:gridCol w:w="2880"/>
+        <w:gridCol w:w="2880"/>
+        <w:gridCol w:w="2880"/>
+      </w:tblGrid>
+      <w:tr>
+        <w:tc>
+          <w:tcPr>
+            <w:tcW w:type="dxa" w:w="2880"/>
+            <w:shd w:val="clear" w:color="auto" w:fill="1F4E78"/>
+          </w:tcPr>
+          <w:p>
+            <w:r>
+              <w:rPr>
+                <w:b/>
+                <w:color w:val="FFFFFF"/>
+              </w:rPr>
+              <w:t>7-day field</w:t>
+            </w:r>
+          </w:p>
+        </w:tc>
+        <w:tc>
+          <w:tcPr>
+            <w:tcW w:type="dxa" w:w="2880"/>
+            <w:shd w:val="clear" w:color="auto" w:fill="1F4E78"/>
+          </w:tcPr>
+          <w:p>
+            <w:r>
+              <w:rPr>
+                <w:b/>
+                <w:color w:val="FFFFFF"/>
+              </w:rPr>
+              <w:t>30-day field</w:t>
+            </w:r>
+          </w:p>
+        </w:tc>
+        <w:tc>
+          <w:tcPr>
+            <w:tcW w:type="dxa" w:w="2880"/>
+            <w:shd w:val="clear" w:color="auto" w:fill="1F4E78"/>
+          </w:tcPr>
+          <w:p>
+            <w:r>
+              <w:rPr>
+                <w:b/>
+                <w:color w:val="FFFFFF"/>
+              </w:rPr>
+              <w:t>Meaning</w:t>
+            </w:r>
+          </w:p>
+        </w:tc>
+      </w:tr>
+      <w:tr>
+        <w:tc>
+          <w:tcPr>
+            <w:tcW w:type="dxa" w:w="2880"/>
+          </w:tcPr>
+          <w:p>
+            <w:r>
+              <w:t>productivity</w:t>
+            </w:r>
+          </w:p>
+        </w:tc>
+        <w:tc>
+          <w:tcPr>
+            <w:tcW w:type="dxa" w:w="2880"/>
+          </w:tcPr>
+          <w:p>
+            <w:r>
+              <w:t>productivity30</w:t>
+            </w:r>
+          </w:p>
+        </w:tc>
+        <w:tc>
+          <w:tcPr>
+            <w:tcW w:type="dxa" w:w="2880"/>
+          </w:tcPr>
+          <w:p>
+            <w:r>
+              <w:t>Pooled productivity ratio shown in the Productivity field (piles ÷ machine-hours, summed over the window)</w:t>
+            </w:r>
+          </w:p>
+        </w:tc>
+      </w:tr>
+      <w:tr>
+        <w:tc>
+          <w:tcPr>
+            <w:tcW w:type="dxa" w:w="2880"/>
+          </w:tcPr>
+          <w:p>
+            <w:r>
+              <w:t>rampProfile</w:t>
+            </w:r>
+          </w:p>
+        </w:tc>
+        <w:tc>
+          <w:tcPr>
+            <w:tcW w:type="dxa" w:w="2880"/>
+          </w:tcPr>
+          <w:p>
+            <w:r>
+              <w:t>rampProfile30</w:t>
+            </w:r>
+          </w:p>
+        </w:tc>
+        <w:tc>
+          <w:tcPr>
+            <w:tcW w:type="dxa" w:w="2880"/>
+          </w:tcPr>
+          <w:p>
+            <w:r>
+              <w:t>The multiplier array (0–1) for the Ramp-up curve</w:t>
+            </w:r>
+          </w:p>
+        </w:tc>
+      </w:tr>
+      <w:tr>
+        <w:tc>
+          <w:tcPr>
+            <w:tcW w:type="dxa" w:w="2880"/>
+          </w:tcPr>
+          <w:p>
+            <w:r>
+              <w:t>rampN</w:t>
+            </w:r>
+          </w:p>
+        </w:tc>
+        <w:tc>
+          <w:tcPr>
+            <w:tcW w:type="dxa" w:w="2880"/>
+          </w:tcPr>
+          <w:p>
+            <w:r>
+              <w:t>rampN30</w:t>
+            </w:r>
+          </w:p>
+        </w:tc>
+        <w:tc>
+          <w:tcPr>
+            <w:tcW w:type="dxa" w:w="2880"/>
+          </w:tcPr>
+          <w:p>
+            <w:r>
+              <w:t>Ramp length in days (profile.length - 1), shown as “n=” on the chart</w:t>
+            </w:r>
+          </w:p>
+        </w:tc>
+      </w:tr>
+      <w:tr>
+        <w:tc>
+          <w:tcPr>
+            <w:tcW w:type="dxa" w:w="2880"/>
+          </w:tcPr>
+          <w:p>
+            <w:r>
+              <w:t>rampSource</w:t>
+            </w:r>
+          </w:p>
+        </w:tc>
+        <w:tc>
+          <w:tcPr>
+            <w:tcW w:type="dxa" w:w="2880"/>
+          </w:tcPr>
+          <w:p>
+            <w:r>
+              <w:t>rampSource30</w:t>
+            </w:r>
+          </w:p>
+        </w:tc>
+        <w:tc>
+          <w:tcPr>
+            <w:tcW w:type="dxa" w:w="2880"/>
+          </w:tcPr>
+          <w:p>
+            <w:r>
+              <w:t>"adaptive" (data-driven) or "fallback" (no usable data in the window)</w:t>
+            </w:r>
+          </w:p>
+        </w:tc>
+      </w:tr>
+      <w:tr>
+        <w:tc>
+          <w:tcPr>
+            <w:tcW w:type="dxa" w:w="2880"/>
+          </w:tcPr>
+          <w:p>
+            <w:r>
+              <w:t>rampExplanation</w:t>
+            </w:r>
+          </w:p>
+        </w:tc>
+        <w:tc>
+          <w:tcPr>
+            <w:tcW w:type="dxa" w:w="2880"/>
+          </w:tcPr>
+          <w:p>
+            <w:r>
+              <w:t>rampExplanation30</w:t>
+            </w:r>
+          </w:p>
+        </w:tc>
+        <w:tc>
+          <w:tcPr>
+            <w:tcW w:type="dxa" w:w="2880"/>
+          </w:tcPr>
+          <w:p>
+            <w:r>
+              <w:t>Human-readable derivation text shown in the info tooltip</w:t>
+            </w:r>
+          </w:p>
+        </w:tc>
+      </w:tr>
+    </w:tbl>
+    <w:p>
+      <w:r>
+        <w:t>UI wiring: js/ui.js — applyProductivity(). When the toggle is switched, this function reads productivity30 / rampProfile30 / rampN30 / rampExplanation30 instead of the 7-day fields and repopulates #pProductivity, #pRampN, #pRampProfile and the info tooltip together, then re-renders the chart (renderRampChart()). Selecting “Last 7 days” again switches all of them back.</w:t>
+      </w:r>
+    </w:p>
+    <w:p>
+      <w:r>
+        <w:t>Everything else in the plan — Machines Deployable, Manpower, Workhours/day, Work Days/week — always stays on the 7-day window regardless of which productivity basis is selected. Only the Productivity number and the Ramp-up curve move together.</w:t>
       </w:r>
     </w:p>
     <w:p>

</xml_diff>